<commit_message>
fix: update team contribution ratings
</commit_message>
<xml_diff>
--- a/DOCX/Report.docx
+++ b/DOCX/Report.docx
@@ -1694,6 +1694,10 @@
         <w:tblW w:w="9346" w:type="dxa"/>
         <w:tblCellSpacing w:w="15" w:type="dxa"/>
         <w:tblBorders>
+          <w:top w:val="single" w:sz="4" w:space="0" w:color="auto"/>
+          <w:left w:val="single" w:sz="4" w:space="0" w:color="auto"/>
+          <w:bottom w:val="single" w:sz="4" w:space="0" w:color="auto"/>
+          <w:right w:val="single" w:sz="4" w:space="0" w:color="auto"/>
           <w:insideH w:val="single" w:sz="4" w:space="0" w:color="auto"/>
           <w:insideV w:val="single" w:sz="4" w:space="0" w:color="auto"/>
         </w:tblBorders>
@@ -1714,12 +1718,6 @@
         <w:tc>
           <w:tcPr>
             <w:tcW w:w="503" w:type="dxa"/>
-            <w:tcBorders>
-              <w:top w:val="single" w:sz="4" w:space="0" w:color="auto"/>
-              <w:left w:val="single" w:sz="4" w:space="0" w:color="auto"/>
-              <w:bottom w:val="single" w:sz="4" w:space="0" w:color="auto"/>
-              <w:right w:val="single" w:sz="4" w:space="0" w:color="auto"/>
-            </w:tcBorders>
             <w:tcMar>
               <w:top w:w="15" w:type="dxa"/>
               <w:left w:w="15" w:type="dxa"/>
@@ -1748,12 +1746,6 @@
         <w:tc>
           <w:tcPr>
             <w:tcW w:w="1407" w:type="dxa"/>
-            <w:tcBorders>
-              <w:top w:val="single" w:sz="4" w:space="0" w:color="auto"/>
-              <w:left w:val="single" w:sz="4" w:space="0" w:color="auto"/>
-              <w:bottom w:val="single" w:sz="4" w:space="0" w:color="auto"/>
-              <w:right w:val="single" w:sz="4" w:space="0" w:color="auto"/>
-            </w:tcBorders>
             <w:tcMar>
               <w:top w:w="15" w:type="dxa"/>
               <w:left w:w="15" w:type="dxa"/>
@@ -1791,12 +1783,6 @@
         <w:tc>
           <w:tcPr>
             <w:tcW w:w="2096" w:type="dxa"/>
-            <w:tcBorders>
-              <w:top w:val="single" w:sz="4" w:space="0" w:color="auto"/>
-              <w:left w:val="single" w:sz="4" w:space="0" w:color="auto"/>
-              <w:bottom w:val="single" w:sz="4" w:space="0" w:color="auto"/>
-              <w:right w:val="single" w:sz="4" w:space="0" w:color="auto"/>
-            </w:tcBorders>
             <w:tcMar>
               <w:top w:w="15" w:type="dxa"/>
               <w:left w:w="15" w:type="dxa"/>
@@ -1834,12 +1820,6 @@
         <w:tc>
           <w:tcPr>
             <w:tcW w:w="5190" w:type="dxa"/>
-            <w:tcBorders>
-              <w:top w:val="single" w:sz="4" w:space="0" w:color="auto"/>
-              <w:left w:val="single" w:sz="4" w:space="0" w:color="auto"/>
-              <w:bottom w:val="single" w:sz="4" w:space="0" w:color="auto"/>
-              <w:right w:val="single" w:sz="4" w:space="0" w:color="auto"/>
-            </w:tcBorders>
             <w:tcMar>
               <w:top w:w="15" w:type="dxa"/>
               <w:left w:w="15" w:type="dxa"/>
@@ -1923,12 +1903,6 @@
         <w:tc>
           <w:tcPr>
             <w:tcW w:w="503" w:type="dxa"/>
-            <w:tcBorders>
-              <w:top w:val="single" w:sz="4" w:space="0" w:color="auto"/>
-              <w:left w:val="single" w:sz="4" w:space="0" w:color="auto"/>
-              <w:bottom w:val="single" w:sz="4" w:space="0" w:color="auto"/>
-              <w:right w:val="single" w:sz="4" w:space="0" w:color="auto"/>
-            </w:tcBorders>
             <w:tcMar>
               <w:top w:w="15" w:type="dxa"/>
               <w:left w:w="15" w:type="dxa"/>
@@ -1947,12 +1921,6 @@
         <w:tc>
           <w:tcPr>
             <w:tcW w:w="1407" w:type="dxa"/>
-            <w:tcBorders>
-              <w:top w:val="single" w:sz="4" w:space="0" w:color="auto"/>
-              <w:left w:val="single" w:sz="4" w:space="0" w:color="auto"/>
-              <w:bottom w:val="single" w:sz="4" w:space="0" w:color="auto"/>
-              <w:right w:val="single" w:sz="4" w:space="0" w:color="auto"/>
-            </w:tcBorders>
             <w:tcMar>
               <w:top w:w="15" w:type="dxa"/>
               <w:left w:w="15" w:type="dxa"/>
@@ -1971,12 +1939,6 @@
         <w:tc>
           <w:tcPr>
             <w:tcW w:w="2096" w:type="dxa"/>
-            <w:tcBorders>
-              <w:top w:val="single" w:sz="4" w:space="0" w:color="auto"/>
-              <w:left w:val="single" w:sz="4" w:space="0" w:color="auto"/>
-              <w:bottom w:val="single" w:sz="4" w:space="0" w:color="auto"/>
-              <w:right w:val="single" w:sz="4" w:space="0" w:color="auto"/>
-            </w:tcBorders>
             <w:tcMar>
               <w:top w:w="15" w:type="dxa"/>
               <w:left w:w="15" w:type="dxa"/>
@@ -2045,12 +2007,6 @@
         <w:tc>
           <w:tcPr>
             <w:tcW w:w="5190" w:type="dxa"/>
-            <w:tcBorders>
-              <w:top w:val="single" w:sz="4" w:space="0" w:color="auto"/>
-              <w:left w:val="single" w:sz="4" w:space="0" w:color="auto"/>
-              <w:bottom w:val="single" w:sz="4" w:space="0" w:color="auto"/>
-              <w:right w:val="single" w:sz="4" w:space="0" w:color="auto"/>
-            </w:tcBorders>
             <w:tcMar>
               <w:top w:w="15" w:type="dxa"/>
               <w:left w:w="15" w:type="dxa"/>
@@ -2244,12 +2200,6 @@
         <w:tc>
           <w:tcPr>
             <w:tcW w:w="503" w:type="dxa"/>
-            <w:tcBorders>
-              <w:top w:val="single" w:sz="4" w:space="0" w:color="auto"/>
-              <w:left w:val="single" w:sz="4" w:space="0" w:color="auto"/>
-              <w:bottom w:val="single" w:sz="4" w:space="0" w:color="auto"/>
-              <w:right w:val="single" w:sz="4" w:space="0" w:color="auto"/>
-            </w:tcBorders>
             <w:tcMar>
               <w:top w:w="15" w:type="dxa"/>
               <w:left w:w="15" w:type="dxa"/>
@@ -2268,12 +2218,6 @@
         <w:tc>
           <w:tcPr>
             <w:tcW w:w="1407" w:type="dxa"/>
-            <w:tcBorders>
-              <w:top w:val="single" w:sz="4" w:space="0" w:color="auto"/>
-              <w:left w:val="single" w:sz="4" w:space="0" w:color="auto"/>
-              <w:bottom w:val="single" w:sz="4" w:space="0" w:color="auto"/>
-              <w:right w:val="single" w:sz="4" w:space="0" w:color="auto"/>
-            </w:tcBorders>
             <w:tcMar>
               <w:top w:w="15" w:type="dxa"/>
               <w:left w:w="15" w:type="dxa"/>
@@ -2292,12 +2236,6 @@
         <w:tc>
           <w:tcPr>
             <w:tcW w:w="2096" w:type="dxa"/>
-            <w:tcBorders>
-              <w:top w:val="single" w:sz="4" w:space="0" w:color="auto"/>
-              <w:left w:val="single" w:sz="4" w:space="0" w:color="auto"/>
-              <w:bottom w:val="single" w:sz="4" w:space="0" w:color="auto"/>
-              <w:right w:val="single" w:sz="4" w:space="0" w:color="auto"/>
-            </w:tcBorders>
             <w:tcMar>
               <w:top w:w="15" w:type="dxa"/>
               <w:left w:w="15" w:type="dxa"/>
@@ -2337,12 +2275,6 @@
         <w:tc>
           <w:tcPr>
             <w:tcW w:w="5190" w:type="dxa"/>
-            <w:tcBorders>
-              <w:top w:val="single" w:sz="4" w:space="0" w:color="auto"/>
-              <w:left w:val="single" w:sz="4" w:space="0" w:color="auto"/>
-              <w:bottom w:val="single" w:sz="4" w:space="0" w:color="auto"/>
-              <w:right w:val="single" w:sz="4" w:space="0" w:color="auto"/>
-            </w:tcBorders>
             <w:tcMar>
               <w:top w:w="15" w:type="dxa"/>
               <w:left w:w="15" w:type="dxa"/>
@@ -2464,12 +2396,6 @@
         <w:tc>
           <w:tcPr>
             <w:tcW w:w="503" w:type="dxa"/>
-            <w:tcBorders>
-              <w:top w:val="single" w:sz="4" w:space="0" w:color="auto"/>
-              <w:left w:val="single" w:sz="4" w:space="0" w:color="auto"/>
-              <w:bottom w:val="single" w:sz="4" w:space="0" w:color="auto"/>
-              <w:right w:val="single" w:sz="4" w:space="0" w:color="auto"/>
-            </w:tcBorders>
             <w:tcMar>
               <w:top w:w="15" w:type="dxa"/>
               <w:left w:w="15" w:type="dxa"/>
@@ -2488,12 +2414,6 @@
         <w:tc>
           <w:tcPr>
             <w:tcW w:w="1407" w:type="dxa"/>
-            <w:tcBorders>
-              <w:top w:val="single" w:sz="4" w:space="0" w:color="auto"/>
-              <w:left w:val="single" w:sz="4" w:space="0" w:color="auto"/>
-              <w:bottom w:val="single" w:sz="4" w:space="0" w:color="auto"/>
-              <w:right w:val="single" w:sz="4" w:space="0" w:color="auto"/>
-            </w:tcBorders>
             <w:tcMar>
               <w:top w:w="15" w:type="dxa"/>
               <w:left w:w="15" w:type="dxa"/>
@@ -2514,12 +2434,6 @@
         <w:tc>
           <w:tcPr>
             <w:tcW w:w="2096" w:type="dxa"/>
-            <w:tcBorders>
-              <w:top w:val="single" w:sz="4" w:space="0" w:color="auto"/>
-              <w:left w:val="single" w:sz="4" w:space="0" w:color="auto"/>
-              <w:bottom w:val="single" w:sz="4" w:space="0" w:color="auto"/>
-              <w:right w:val="single" w:sz="4" w:space="0" w:color="auto"/>
-            </w:tcBorders>
             <w:tcMar>
               <w:top w:w="15" w:type="dxa"/>
               <w:left w:w="15" w:type="dxa"/>
@@ -2559,12 +2473,6 @@
         <w:tc>
           <w:tcPr>
             <w:tcW w:w="5190" w:type="dxa"/>
-            <w:tcBorders>
-              <w:top w:val="single" w:sz="4" w:space="0" w:color="auto"/>
-              <w:left w:val="single" w:sz="4" w:space="0" w:color="auto"/>
-              <w:bottom w:val="single" w:sz="4" w:space="0" w:color="auto"/>
-              <w:right w:val="single" w:sz="4" w:space="0" w:color="auto"/>
-            </w:tcBorders>
             <w:tcMar>
               <w:top w:w="15" w:type="dxa"/>
               <w:left w:w="15" w:type="dxa"/>
@@ -2734,12 +2642,6 @@
         <w:tc>
           <w:tcPr>
             <w:tcW w:w="503" w:type="dxa"/>
-            <w:tcBorders>
-              <w:top w:val="single" w:sz="4" w:space="0" w:color="auto"/>
-              <w:left w:val="single" w:sz="4" w:space="0" w:color="auto"/>
-              <w:bottom w:val="single" w:sz="4" w:space="0" w:color="auto"/>
-              <w:right w:val="single" w:sz="4" w:space="0" w:color="auto"/>
-            </w:tcBorders>
             <w:tcMar>
               <w:top w:w="15" w:type="dxa"/>
               <w:left w:w="15" w:type="dxa"/>
@@ -2758,12 +2660,6 @@
         <w:tc>
           <w:tcPr>
             <w:tcW w:w="1407" w:type="dxa"/>
-            <w:tcBorders>
-              <w:top w:val="single" w:sz="4" w:space="0" w:color="auto"/>
-              <w:left w:val="single" w:sz="4" w:space="0" w:color="auto"/>
-              <w:bottom w:val="single" w:sz="4" w:space="0" w:color="auto"/>
-              <w:right w:val="single" w:sz="4" w:space="0" w:color="auto"/>
-            </w:tcBorders>
             <w:tcMar>
               <w:top w:w="15" w:type="dxa"/>
               <w:left w:w="15" w:type="dxa"/>
@@ -2782,12 +2678,6 @@
         <w:tc>
           <w:tcPr>
             <w:tcW w:w="2096" w:type="dxa"/>
-            <w:tcBorders>
-              <w:top w:val="single" w:sz="4" w:space="0" w:color="auto"/>
-              <w:left w:val="single" w:sz="4" w:space="0" w:color="auto"/>
-              <w:bottom w:val="single" w:sz="4" w:space="0" w:color="auto"/>
-              <w:right w:val="single" w:sz="4" w:space="0" w:color="auto"/>
-            </w:tcBorders>
             <w:tcMar>
               <w:top w:w="15" w:type="dxa"/>
               <w:left w:w="15" w:type="dxa"/>
@@ -2848,12 +2738,6 @@
         <w:tc>
           <w:tcPr>
             <w:tcW w:w="5190" w:type="dxa"/>
-            <w:tcBorders>
-              <w:top w:val="single" w:sz="4" w:space="0" w:color="auto"/>
-              <w:left w:val="single" w:sz="4" w:space="0" w:color="auto"/>
-              <w:bottom w:val="single" w:sz="4" w:space="0" w:color="auto"/>
-              <w:right w:val="single" w:sz="4" w:space="0" w:color="auto"/>
-            </w:tcBorders>
             <w:tcMar>
               <w:top w:w="15" w:type="dxa"/>
               <w:left w:w="15" w:type="dxa"/>
@@ -2967,12 +2851,6 @@
         <w:tc>
           <w:tcPr>
             <w:tcW w:w="503" w:type="dxa"/>
-            <w:tcBorders>
-              <w:top w:val="single" w:sz="4" w:space="0" w:color="auto"/>
-              <w:left w:val="single" w:sz="4" w:space="0" w:color="auto"/>
-              <w:bottom w:val="single" w:sz="4" w:space="0" w:color="auto"/>
-              <w:right w:val="single" w:sz="4" w:space="0" w:color="auto"/>
-            </w:tcBorders>
             <w:tcMar>
               <w:top w:w="15" w:type="dxa"/>
               <w:left w:w="15" w:type="dxa"/>
@@ -2991,12 +2869,6 @@
         <w:tc>
           <w:tcPr>
             <w:tcW w:w="1407" w:type="dxa"/>
-            <w:tcBorders>
-              <w:top w:val="single" w:sz="4" w:space="0" w:color="auto"/>
-              <w:left w:val="single" w:sz="4" w:space="0" w:color="auto"/>
-              <w:bottom w:val="single" w:sz="4" w:space="0" w:color="auto"/>
-              <w:right w:val="single" w:sz="4" w:space="0" w:color="auto"/>
-            </w:tcBorders>
             <w:tcMar>
               <w:top w:w="15" w:type="dxa"/>
               <w:left w:w="15" w:type="dxa"/>
@@ -3015,12 +2887,6 @@
         <w:tc>
           <w:tcPr>
             <w:tcW w:w="2096" w:type="dxa"/>
-            <w:tcBorders>
-              <w:top w:val="single" w:sz="4" w:space="0" w:color="auto"/>
-              <w:left w:val="single" w:sz="4" w:space="0" w:color="auto"/>
-              <w:bottom w:val="single" w:sz="4" w:space="0" w:color="auto"/>
-              <w:right w:val="single" w:sz="4" w:space="0" w:color="auto"/>
-            </w:tcBorders>
             <w:tcMar>
               <w:top w:w="15" w:type="dxa"/>
               <w:left w:w="15" w:type="dxa"/>
@@ -3065,12 +2931,6 @@
         <w:tc>
           <w:tcPr>
             <w:tcW w:w="5190" w:type="dxa"/>
-            <w:tcBorders>
-              <w:top w:val="single" w:sz="4" w:space="0" w:color="auto"/>
-              <w:left w:val="single" w:sz="4" w:space="0" w:color="auto"/>
-              <w:bottom w:val="single" w:sz="4" w:space="0" w:color="auto"/>
-              <w:right w:val="single" w:sz="4" w:space="0" w:color="auto"/>
-            </w:tcBorders>
             <w:tcMar>
               <w:top w:w="15" w:type="dxa"/>
               <w:left w:w="15" w:type="dxa"/>
@@ -3209,6 +3069,532 @@
           <w:bCs/>
         </w:rPr>
       </w:pPr>
+    </w:p>
+    <w:tbl>
+      <w:tblPr>
+        <w:tblW w:w="9206" w:type="dxa"/>
+        <w:tblCellSpacing w:w="15" w:type="dxa"/>
+        <w:tblBorders>
+          <w:top w:val="single" w:sz="4" w:space="0" w:color="auto"/>
+          <w:left w:val="single" w:sz="4" w:space="0" w:color="auto"/>
+          <w:bottom w:val="single" w:sz="4" w:space="0" w:color="auto"/>
+          <w:right w:val="single" w:sz="4" w:space="0" w:color="auto"/>
+          <w:insideH w:val="single" w:sz="4" w:space="0" w:color="auto"/>
+          <w:insideV w:val="single" w:sz="4" w:space="0" w:color="auto"/>
+        </w:tblBorders>
+        <w:tblCellMar>
+          <w:left w:w="0" w:type="dxa"/>
+          <w:right w:w="0" w:type="dxa"/>
+        </w:tblCellMar>
+        <w:tblLook w:val="04A0" w:firstRow="1" w:lastRow="0" w:firstColumn="1" w:lastColumn="0" w:noHBand="0" w:noVBand="1"/>
+      </w:tblPr>
+      <w:tblGrid>
+        <w:gridCol w:w="1835"/>
+        <w:gridCol w:w="7371"/>
+      </w:tblGrid>
+      <w:tr>
+        <w:trPr>
+          <w:tblHeader/>
+          <w:tblCellSpacing w:w="15" w:type="dxa"/>
+        </w:trPr>
+        <w:tc>
+          <w:tcPr>
+            <w:tcW w:w="1790" w:type="dxa"/>
+            <w:tcMar>
+              <w:top w:w="240" w:type="dxa"/>
+              <w:left w:w="0" w:type="dxa"/>
+              <w:bottom w:w="240" w:type="dxa"/>
+              <w:right w:w="180" w:type="dxa"/>
+            </w:tcMar>
+            <w:vAlign w:val="center"/>
+            <w:hideMark/>
+          </w:tcPr>
+          <w:p>
+            <w:pPr>
+              <w:rPr>
+                <w:b/>
+                <w:bCs/>
+              </w:rPr>
+            </w:pPr>
+            <w:r>
+              <w:rPr>
+                <w:b/>
+                <w:bCs/>
+              </w:rPr>
+              <w:lastRenderedPageBreak/>
+              <w:t xml:space="preserve">Thành </w:t>
+            </w:r>
+            <w:proofErr w:type="spellStart"/>
+            <w:r>
+              <w:rPr>
+                <w:b/>
+                <w:bCs/>
+              </w:rPr>
+              <w:t>viên</w:t>
+            </w:r>
+            <w:proofErr w:type="spellEnd"/>
+          </w:p>
+        </w:tc>
+        <w:tc>
+          <w:tcPr>
+            <w:tcW w:w="7326" w:type="dxa"/>
+            <w:tcMar>
+              <w:top w:w="240" w:type="dxa"/>
+              <w:left w:w="0" w:type="dxa"/>
+              <w:bottom w:w="240" w:type="dxa"/>
+              <w:right w:w="0" w:type="dxa"/>
+            </w:tcMar>
+            <w:vAlign w:val="center"/>
+            <w:hideMark/>
+          </w:tcPr>
+          <w:p>
+            <w:pPr>
+              <w:rPr>
+                <w:b/>
+                <w:bCs/>
+              </w:rPr>
+            </w:pPr>
+            <w:proofErr w:type="spellStart"/>
+            <w:r>
+              <w:rPr>
+                <w:b/>
+                <w:bCs/>
+              </w:rPr>
+              <w:t>Mức</w:t>
+            </w:r>
+            <w:proofErr w:type="spellEnd"/>
+            <w:r>
+              <w:rPr>
+                <w:b/>
+                <w:bCs/>
+              </w:rPr>
+              <w:t xml:space="preserve"> </w:t>
+            </w:r>
+            <w:proofErr w:type="spellStart"/>
+            <w:r>
+              <w:rPr>
+                <w:b/>
+                <w:bCs/>
+              </w:rPr>
+              <w:t>độ</w:t>
+            </w:r>
+            <w:proofErr w:type="spellEnd"/>
+            <w:r>
+              <w:rPr>
+                <w:b/>
+                <w:bCs/>
+              </w:rPr>
+              <w:t xml:space="preserve"> </w:t>
+            </w:r>
+            <w:proofErr w:type="spellStart"/>
+            <w:r>
+              <w:rPr>
+                <w:b/>
+                <w:bCs/>
+              </w:rPr>
+              <w:t>đóng</w:t>
+            </w:r>
+            <w:proofErr w:type="spellEnd"/>
+            <w:r>
+              <w:rPr>
+                <w:b/>
+                <w:bCs/>
+              </w:rPr>
+              <w:t xml:space="preserve"> </w:t>
+            </w:r>
+            <w:proofErr w:type="spellStart"/>
+            <w:r>
+              <w:rPr>
+                <w:b/>
+                <w:bCs/>
+              </w:rPr>
+              <w:t>góp</w:t>
+            </w:r>
+            <w:proofErr w:type="spellEnd"/>
+            <w:r>
+              <w:rPr>
+                <w:b/>
+                <w:bCs/>
+              </w:rPr>
+              <w:t xml:space="preserve"> </w:t>
+            </w:r>
+            <w:proofErr w:type="gramStart"/>
+            <w:r>
+              <w:rPr>
+                <w:b/>
+                <w:bCs/>
+              </w:rPr>
+              <w:t xml:space="preserve">( </w:t>
+            </w:r>
+            <w:proofErr w:type="spellStart"/>
+            <w:r>
+              <w:rPr>
+                <w:b/>
+                <w:bCs/>
+              </w:rPr>
+              <w:t>Mặc</w:t>
+            </w:r>
+            <w:proofErr w:type="spellEnd"/>
+            <w:proofErr w:type="gramEnd"/>
+            <w:r>
+              <w:rPr>
+                <w:b/>
+                <w:bCs/>
+              </w:rPr>
+              <w:t xml:space="preserve"> </w:t>
+            </w:r>
+            <w:proofErr w:type="spellStart"/>
+            <w:r>
+              <w:rPr>
+                <w:b/>
+                <w:bCs/>
+              </w:rPr>
+              <w:t>định</w:t>
+            </w:r>
+            <w:proofErr w:type="spellEnd"/>
+            <w:r>
+              <w:rPr>
+                <w:b/>
+                <w:bCs/>
+              </w:rPr>
+              <w:t xml:space="preserve"> 80</w:t>
+            </w:r>
+            <w:proofErr w:type="gramStart"/>
+            <w:r>
+              <w:rPr>
+                <w:b/>
+                <w:bCs/>
+              </w:rPr>
+              <w:t>% )</w:t>
+            </w:r>
+            <w:proofErr w:type="gramEnd"/>
+          </w:p>
+        </w:tc>
+      </w:tr>
+      <w:tr>
+        <w:trPr>
+          <w:tblCellSpacing w:w="15" w:type="dxa"/>
+        </w:trPr>
+        <w:tc>
+          <w:tcPr>
+            <w:tcW w:w="1790" w:type="dxa"/>
+            <w:tcMar>
+              <w:top w:w="240" w:type="dxa"/>
+              <w:left w:w="0" w:type="dxa"/>
+              <w:bottom w:w="240" w:type="dxa"/>
+              <w:right w:w="180" w:type="dxa"/>
+            </w:tcMar>
+            <w:vAlign w:val="center"/>
+            <w:hideMark/>
+          </w:tcPr>
+          <w:p>
+            <w:pPr>
+              <w:rPr>
+                <w:b/>
+                <w:bCs/>
+              </w:rPr>
+            </w:pPr>
+            <w:r>
+              <w:rPr>
+                <w:b/>
+                <w:bCs/>
+              </w:rPr>
+              <w:t>Đăng</w:t>
+            </w:r>
+          </w:p>
+        </w:tc>
+        <w:tc>
+          <w:tcPr>
+            <w:tcW w:w="7326" w:type="dxa"/>
+            <w:tcMar>
+              <w:top w:w="240" w:type="dxa"/>
+              <w:left w:w="0" w:type="dxa"/>
+              <w:bottom w:w="240" w:type="dxa"/>
+              <w:right w:w="0" w:type="dxa"/>
+            </w:tcMar>
+            <w:vAlign w:val="center"/>
+            <w:hideMark/>
+          </w:tcPr>
+          <w:p>
+            <w:pPr>
+              <w:rPr>
+                <w:b/>
+                <w:bCs/>
+              </w:rPr>
+            </w:pPr>
+            <w:r>
+              <w:rPr>
+                <w:b/>
+                <w:bCs/>
+              </w:rPr>
+              <w:t>100%</w:t>
+            </w:r>
+          </w:p>
+        </w:tc>
+      </w:tr>
+      <w:tr>
+        <w:trPr>
+          <w:tblCellSpacing w:w="15" w:type="dxa"/>
+        </w:trPr>
+        <w:tc>
+          <w:tcPr>
+            <w:tcW w:w="1790" w:type="dxa"/>
+            <w:tcMar>
+              <w:top w:w="240" w:type="dxa"/>
+              <w:left w:w="0" w:type="dxa"/>
+              <w:bottom w:w="240" w:type="dxa"/>
+              <w:right w:w="180" w:type="dxa"/>
+            </w:tcMar>
+            <w:vAlign w:val="center"/>
+            <w:hideMark/>
+          </w:tcPr>
+          <w:p>
+            <w:pPr>
+              <w:rPr>
+                <w:b/>
+                <w:bCs/>
+              </w:rPr>
+            </w:pPr>
+            <w:r>
+              <w:rPr>
+                <w:b/>
+                <w:bCs/>
+              </w:rPr>
+              <w:t>Huy</w:t>
+            </w:r>
+          </w:p>
+        </w:tc>
+        <w:tc>
+          <w:tcPr>
+            <w:tcW w:w="7326" w:type="dxa"/>
+            <w:tcMar>
+              <w:top w:w="240" w:type="dxa"/>
+              <w:left w:w="0" w:type="dxa"/>
+              <w:bottom w:w="240" w:type="dxa"/>
+              <w:right w:w="0" w:type="dxa"/>
+            </w:tcMar>
+            <w:vAlign w:val="center"/>
+            <w:hideMark/>
+          </w:tcPr>
+          <w:p>
+            <w:pPr>
+              <w:rPr>
+                <w:b/>
+                <w:bCs/>
+              </w:rPr>
+            </w:pPr>
+            <w:r>
+              <w:rPr>
+                <w:b/>
+                <w:bCs/>
+              </w:rPr>
+              <w:t>100%</w:t>
+            </w:r>
+          </w:p>
+        </w:tc>
+      </w:tr>
+      <w:tr>
+        <w:trPr>
+          <w:tblCellSpacing w:w="15" w:type="dxa"/>
+        </w:trPr>
+        <w:tc>
+          <w:tcPr>
+            <w:tcW w:w="1790" w:type="dxa"/>
+            <w:tcMar>
+              <w:top w:w="240" w:type="dxa"/>
+              <w:left w:w="0" w:type="dxa"/>
+              <w:bottom w:w="240" w:type="dxa"/>
+              <w:right w:w="180" w:type="dxa"/>
+            </w:tcMar>
+            <w:vAlign w:val="center"/>
+            <w:hideMark/>
+          </w:tcPr>
+          <w:p>
+            <w:pPr>
+              <w:rPr>
+                <w:b/>
+                <w:bCs/>
+              </w:rPr>
+            </w:pPr>
+            <w:proofErr w:type="spellStart"/>
+            <w:r>
+              <w:rPr>
+                <w:b/>
+                <w:bCs/>
+              </w:rPr>
+              <w:t>Lộc</w:t>
+            </w:r>
+            <w:proofErr w:type="spellEnd"/>
+          </w:p>
+        </w:tc>
+        <w:tc>
+          <w:tcPr>
+            <w:tcW w:w="7326" w:type="dxa"/>
+            <w:tcMar>
+              <w:top w:w="240" w:type="dxa"/>
+              <w:left w:w="0" w:type="dxa"/>
+              <w:bottom w:w="240" w:type="dxa"/>
+              <w:right w:w="0" w:type="dxa"/>
+            </w:tcMar>
+            <w:vAlign w:val="center"/>
+            <w:hideMark/>
+          </w:tcPr>
+          <w:p>
+            <w:pPr>
+              <w:rPr>
+                <w:b/>
+                <w:bCs/>
+              </w:rPr>
+            </w:pPr>
+            <w:r>
+              <w:rPr>
+                <w:b/>
+                <w:bCs/>
+              </w:rPr>
+              <w:t>70%</w:t>
+            </w:r>
+          </w:p>
+        </w:tc>
+      </w:tr>
+      <w:tr>
+        <w:trPr>
+          <w:tblCellSpacing w:w="15" w:type="dxa"/>
+        </w:trPr>
+        <w:tc>
+          <w:tcPr>
+            <w:tcW w:w="1790" w:type="dxa"/>
+            <w:tcMar>
+              <w:top w:w="240" w:type="dxa"/>
+              <w:left w:w="0" w:type="dxa"/>
+              <w:bottom w:w="240" w:type="dxa"/>
+              <w:right w:w="180" w:type="dxa"/>
+            </w:tcMar>
+            <w:vAlign w:val="center"/>
+            <w:hideMark/>
+          </w:tcPr>
+          <w:p>
+            <w:pPr>
+              <w:rPr>
+                <w:b/>
+                <w:bCs/>
+              </w:rPr>
+            </w:pPr>
+            <w:r>
+              <w:rPr>
+                <w:b/>
+                <w:bCs/>
+              </w:rPr>
+              <w:t>Quốc</w:t>
+            </w:r>
+          </w:p>
+        </w:tc>
+        <w:tc>
+          <w:tcPr>
+            <w:tcW w:w="7326" w:type="dxa"/>
+            <w:tcMar>
+              <w:top w:w="240" w:type="dxa"/>
+              <w:left w:w="0" w:type="dxa"/>
+              <w:bottom w:w="240" w:type="dxa"/>
+              <w:right w:w="0" w:type="dxa"/>
+            </w:tcMar>
+            <w:vAlign w:val="center"/>
+            <w:hideMark/>
+          </w:tcPr>
+          <w:p>
+            <w:pPr>
+              <w:rPr>
+                <w:b/>
+                <w:bCs/>
+              </w:rPr>
+            </w:pPr>
+            <w:r>
+              <w:rPr>
+                <w:b/>
+                <w:bCs/>
+              </w:rPr>
+              <w:t>60%</w:t>
+            </w:r>
+          </w:p>
+        </w:tc>
+      </w:tr>
+      <w:tr>
+        <w:trPr>
+          <w:trHeight w:val="20"/>
+          <w:tblCellSpacing w:w="15" w:type="dxa"/>
+        </w:trPr>
+        <w:tc>
+          <w:tcPr>
+            <w:tcW w:w="1790" w:type="dxa"/>
+            <w:tcMar>
+              <w:top w:w="240" w:type="dxa"/>
+              <w:left w:w="0" w:type="dxa"/>
+              <w:bottom w:w="240" w:type="dxa"/>
+              <w:right w:w="180" w:type="dxa"/>
+            </w:tcMar>
+            <w:vAlign w:val="center"/>
+            <w:hideMark/>
+          </w:tcPr>
+          <w:p>
+            <w:pPr>
+              <w:rPr>
+                <w:b/>
+                <w:bCs/>
+              </w:rPr>
+            </w:pPr>
+            <w:r>
+              <w:rPr>
+                <w:b/>
+                <w:bCs/>
+              </w:rPr>
+              <w:t>Nguyên</w:t>
+            </w:r>
+          </w:p>
+        </w:tc>
+        <w:tc>
+          <w:tcPr>
+            <w:tcW w:w="7326" w:type="dxa"/>
+            <w:tcMar>
+              <w:top w:w="240" w:type="dxa"/>
+              <w:left w:w="0" w:type="dxa"/>
+              <w:bottom w:w="240" w:type="dxa"/>
+              <w:right w:w="0" w:type="dxa"/>
+            </w:tcMar>
+            <w:vAlign w:val="center"/>
+            <w:hideMark/>
+          </w:tcPr>
+          <w:p>
+            <w:pPr>
+              <w:rPr>
+                <w:b/>
+                <w:bCs/>
+              </w:rPr>
+            </w:pPr>
+            <w:r>
+              <w:rPr>
+                <w:b/>
+                <w:bCs/>
+              </w:rPr>
+              <w:t>60%</w:t>
+            </w:r>
+          </w:p>
+        </w:tc>
+      </w:tr>
+    </w:tbl>
+    <w:p>
+      <w:pPr>
+        <w:rPr>
+          <w:b/>
+          <w:bCs/>
+        </w:rPr>
+      </w:pPr>
+    </w:p>
+    <w:p>
+      <w:pPr>
+        <w:rPr>
+          <w:b/>
+          <w:bCs/>
+        </w:rPr>
+      </w:pPr>
       <w:r>
         <w:rPr>
           <w:b/>
@@ -3331,7 +3717,6 @@
       </w:pPr>
       <w:proofErr w:type="spellStart"/>
       <w:r>
-        <w:lastRenderedPageBreak/>
         <w:t>Phác</w:t>
       </w:r>
       <w:proofErr w:type="spellEnd"/>
@@ -4498,6 +4883,7 @@
           <w:b/>
           <w:bCs/>
         </w:rPr>
+        <w:lastRenderedPageBreak/>
         <w:t>4. KẾT QUẢ KIỂM THỬ</w:t>
       </w:r>
     </w:p>
@@ -6805,99 +7191,27 @@
   </w:abstractNum>
   <w:num w:numId="1" w16cid:durableId="1191066734">
     <w:abstractNumId w:val="7"/>
-    <w:lvlOverride w:ilvl="0"/>
-    <w:lvlOverride w:ilvl="1"/>
-    <w:lvlOverride w:ilvl="2"/>
-    <w:lvlOverride w:ilvl="3"/>
-    <w:lvlOverride w:ilvl="4"/>
-    <w:lvlOverride w:ilvl="5"/>
-    <w:lvlOverride w:ilvl="6"/>
-    <w:lvlOverride w:ilvl="7"/>
-    <w:lvlOverride w:ilvl="8"/>
   </w:num>
   <w:num w:numId="2" w16cid:durableId="39138361">
     <w:abstractNumId w:val="4"/>
-    <w:lvlOverride w:ilvl="0"/>
-    <w:lvlOverride w:ilvl="1"/>
-    <w:lvlOverride w:ilvl="2"/>
-    <w:lvlOverride w:ilvl="3"/>
-    <w:lvlOverride w:ilvl="4"/>
-    <w:lvlOverride w:ilvl="5"/>
-    <w:lvlOverride w:ilvl="6"/>
-    <w:lvlOverride w:ilvl="7"/>
-    <w:lvlOverride w:ilvl="8"/>
   </w:num>
   <w:num w:numId="3" w16cid:durableId="835733691">
     <w:abstractNumId w:val="1"/>
-    <w:lvlOverride w:ilvl="0"/>
-    <w:lvlOverride w:ilvl="1"/>
-    <w:lvlOverride w:ilvl="2"/>
-    <w:lvlOverride w:ilvl="3"/>
-    <w:lvlOverride w:ilvl="4"/>
-    <w:lvlOverride w:ilvl="5"/>
-    <w:lvlOverride w:ilvl="6"/>
-    <w:lvlOverride w:ilvl="7"/>
-    <w:lvlOverride w:ilvl="8"/>
   </w:num>
   <w:num w:numId="4" w16cid:durableId="1381202101">
     <w:abstractNumId w:val="2"/>
-    <w:lvlOverride w:ilvl="0"/>
-    <w:lvlOverride w:ilvl="1"/>
-    <w:lvlOverride w:ilvl="2"/>
-    <w:lvlOverride w:ilvl="3"/>
-    <w:lvlOverride w:ilvl="4"/>
-    <w:lvlOverride w:ilvl="5"/>
-    <w:lvlOverride w:ilvl="6"/>
-    <w:lvlOverride w:ilvl="7"/>
-    <w:lvlOverride w:ilvl="8"/>
   </w:num>
   <w:num w:numId="5" w16cid:durableId="476453789">
     <w:abstractNumId w:val="8"/>
-    <w:lvlOverride w:ilvl="0"/>
-    <w:lvlOverride w:ilvl="1"/>
-    <w:lvlOverride w:ilvl="2"/>
-    <w:lvlOverride w:ilvl="3"/>
-    <w:lvlOverride w:ilvl="4"/>
-    <w:lvlOverride w:ilvl="5"/>
-    <w:lvlOverride w:ilvl="6"/>
-    <w:lvlOverride w:ilvl="7"/>
-    <w:lvlOverride w:ilvl="8"/>
   </w:num>
   <w:num w:numId="6" w16cid:durableId="1010335161">
     <w:abstractNumId w:val="5"/>
-    <w:lvlOverride w:ilvl="0"/>
-    <w:lvlOverride w:ilvl="1"/>
-    <w:lvlOverride w:ilvl="2"/>
-    <w:lvlOverride w:ilvl="3"/>
-    <w:lvlOverride w:ilvl="4"/>
-    <w:lvlOverride w:ilvl="5"/>
-    <w:lvlOverride w:ilvl="6"/>
-    <w:lvlOverride w:ilvl="7"/>
-    <w:lvlOverride w:ilvl="8"/>
   </w:num>
   <w:num w:numId="7" w16cid:durableId="686368951">
     <w:abstractNumId w:val="6"/>
-    <w:lvlOverride w:ilvl="0"/>
-    <w:lvlOverride w:ilvl="1"/>
-    <w:lvlOverride w:ilvl="2"/>
-    <w:lvlOverride w:ilvl="3"/>
-    <w:lvlOverride w:ilvl="4"/>
-    <w:lvlOverride w:ilvl="5"/>
-    <w:lvlOverride w:ilvl="6"/>
-    <w:lvlOverride w:ilvl="7"/>
-    <w:lvlOverride w:ilvl="8"/>
   </w:num>
   <w:num w:numId="8" w16cid:durableId="419718765">
     <w:abstractNumId w:val="3"/>
-    <w:lvlOverride w:ilvl="0"/>
-    <w:lvlOverride w:ilvl="1"/>
-    <w:lvlOverride w:ilvl="2"/>
-    <w:lvlOverride w:ilvl="3"/>
-    <w:lvlOverride w:ilvl="4"/>
-    <w:lvlOverride w:ilvl="5"/>
-    <w:lvlOverride w:ilvl="6"/>
-    <w:lvlOverride w:ilvl="7"/>
-    <w:lvlOverride w:ilvl="8"/>
   </w:num>
   <w:num w:numId="9" w16cid:durableId="15624485">
     <w:abstractNumId w:val="0"/>

</xml_diff>